<commit_message>
Tilføj fotorealistiske illustrationer til tsunamiøvelsen
</commit_message>
<xml_diff>
--- a/Øvelser/Geografi/tsunamiboelgers-hastighed/tsunamiboelgers-hastighed.docx
+++ b/Øvelser/Geografi/tsunamiboelgers-hastighed/tsunamiboelgers-hastighed.docx
@@ -52,7 +52,7 @@
         <w:t xml:space="preserve">________________________________________</w:t>
       </w:r>
     </w:p>
-    <w:bookmarkStart w:id="19" w:name="om-øvelsen"/>
+    <w:bookmarkStart w:id="23" w:name="om-øvelsen"/>
     <w:p>
       <w:pPr>
         <w:pStyle w:val="Heading2"/>
@@ -69,8 +69,87 @@
         <w:t xml:space="preserve">En tsunami kan krydse et helt ocean på få timer. I denne øvelse undersøger I, hvordan en tsunamibølges hastighed afhænger af vanddybden. I laver bølger i et vandkar ved tre forskellige dybder, måler deres fart og sammenligner med den teoretiske formel. Bagefter bruger I formlen på det rigtige ocean.</w:t>
       </w:r>
     </w:p>
-    <w:bookmarkEnd w:id="19"/>
-    <w:bookmarkStart w:id="28" w:name="baggrund"/>
+    <w:tbl>
+      <w:tblPr>
+        <w:tblStyle w:val="Table"/>
+        <w:tblW w:type="pct" w:w="5000"/>
+        <w:tblLayout w:type="fixed"/>
+        <w:tblLook w:firstRow="0" w:lastRow="0" w:firstColumn="0" w:lastColumn="0" w:noHBand="0" w:noVBand="0" w:val="0000"/>
+      </w:tblPr>
+      <w:tblGrid>
+        <w:gridCol w:w="7920"/>
+      </w:tblGrid>
+      <w:tr>
+        <w:tc>
+          <w:tcPr/>
+          <w:bookmarkStart w:id="22" w:name="fig-tsunami-kyst"/>
+          <w:p>
+            <w:pPr>
+              <w:pStyle w:val="Compact"/>
+              <w:jc w:val="center"/>
+            </w:pPr>
+            <w:r>
+              <w:drawing>
+                <wp:inline>
+                  <wp:extent cx="5486400" cy="3657600"/>
+                  <wp:effectExtent b="0" l="0" r="0" t="0"/>
+                  <wp:docPr descr="" title="" id="20" name="Picture"/>
+                  <a:graphic>
+                    <a:graphicData uri="http://schemas.openxmlformats.org/drawingml/2006/picture">
+                      <pic:pic>
+                        <pic:nvPicPr>
+                          <pic:cNvPr descr="figurer/tsunami-kyst.jpg" id="21" name="Picture"/>
+                          <pic:cNvPicPr>
+                            <a:picLocks noChangeArrowheads="1" noChangeAspect="1"/>
+                          </pic:cNvPicPr>
+                        </pic:nvPicPr>
+                        <pic:blipFill>
+                          <a:blip r:embed="rId19"/>
+                          <a:stretch>
+                            <a:fillRect/>
+                          </a:stretch>
+                        </pic:blipFill>
+                        <pic:spPr bwMode="auto">
+                          <a:xfrm>
+                            <a:off x="0" y="0"/>
+                            <a:ext cx="5486400" cy="3657600"/>
+                          </a:xfrm>
+                          <a:prstGeom prst="rect">
+                            <a:avLst/>
+                          </a:prstGeom>
+                          <a:noFill/>
+                          <a:ln w="9525">
+                            <a:noFill/>
+                            <a:headEnd/>
+                            <a:tailEnd/>
+                          </a:ln>
+                        </pic:spPr>
+                      </pic:pic>
+                    </a:graphicData>
+                  </a:graphic>
+                </wp:inline>
+              </w:drawing>
+            </w:r>
+          </w:p>
+          <w:p>
+            <w:pPr>
+              <w:jc w:val="center"/>
+            </w:pPr>
+            <w:pPr>
+              <w:jc w:val="left"/>
+              <w:spacing w:before="200"/>
+              <w:pStyle w:val="ImageCaption"/>
+            </w:pPr>
+            <w:r>
+              <w:t xml:space="preserve">Figur 1: En tsunami kan ved kysten vise sig som en bred strøm af indtrængende vand. På lavt vand falder bølgens hastighed, mens bølgehøjden kan vokse. AI-genereret illustration; ikke en bestemt hændelse eller en gengivelse i målestok.</w:t>
+            </w:r>
+          </w:p>
+          <w:bookmarkEnd w:id="22"/>
+        </w:tc>
+      </w:tr>
+    </w:tbl>
+    <w:bookmarkEnd w:id="23"/>
+    <w:bookmarkStart w:id="31" w:name="baggrund"/>
     <w:p>
       <w:pPr>
         <w:pStyle w:val="Heading2"/>
@@ -91,7 +170,7 @@
           <w:rPr>
             <w:rStyle w:val="Hyperlink"/>
           </w:rPr>
-          <w:t xml:space="preserve">Figur 1</w:t>
+          <w:t xml:space="preserve">Figur 2</w:t>
         </w:r>
       </w:hyperlink>
       <w:r>
@@ -246,7 +325,7 @@
           <w:rPr>
             <w:rStyle w:val="Hyperlink"/>
           </w:rPr>
-          <w:t xml:space="preserve">Figur 1</w:t>
+          <w:t xml:space="preserve">Figur 2</w:t>
         </w:r>
       </w:hyperlink>
       <w:r>
@@ -266,7 +345,7 @@
       <w:tr>
         <w:tc>
           <w:tcPr/>
-          <w:bookmarkStart w:id="24" w:name="fig-tsunami"/>
+          <w:bookmarkStart w:id="27" w:name="fig-tsunami"/>
           <w:p>
             <w:pPr>
               <w:pStyle w:val="Compact"/>
@@ -277,24 +356,24 @@
                 <wp:inline>
                   <wp:extent cx="6096000" cy="4095750"/>
                   <wp:effectExtent b="0" l="0" r="0" t="0"/>
-                  <wp:docPr descr="" title="" id="21" name="Picture"/>
+                  <wp:docPr descr="" title="" id="25" name="Picture"/>
                   <a:graphic>
                     <a:graphicData uri="http://schemas.openxmlformats.org/drawingml/2006/picture">
                       <pic:pic>
                         <pic:nvPicPr>
-                          <pic:cNvPr descr="figurer/tsunami.svg" id="22" name="Picture"/>
+                          <pic:cNvPr descr="figurer/tsunami.svg" id="26" name="Picture"/>
                           <pic:cNvPicPr>
                             <a:picLocks noChangeArrowheads="1" noChangeAspect="1"/>
                           </pic:cNvPicPr>
                         </pic:nvPicPr>
                         <pic:blipFill>
-                          <a:blip r:embed="rId23">
+                          <a:blip>
                             <a:extLst>
                               <a:ext uri="{28A0092B-C50C-407E-A947-70E740481C1C}">
                                 <ns6:useLocalDpi val="0"/>
                               </a:ext>
                               <a:ext uri="{96DAC541-7B7A-43D3-8B79-37D633B846F1}">
-                                <ns7:svgBlip r:embed="rId20"/>
+                                <ns7:svgBlip r:embed="rId24"/>
                               </a:ext>
                             </a:extLst>
                           </a:blip>
@@ -334,10 +413,10 @@
               <w:pStyle w:val="ImageCaption"/>
             </w:pPr>
             <w:r>
-              <w:t xml:space="preserve">Figur 1: Øverst: et jordskælv løfter havbunden, og hele vandsøjlen over den løftes med. Nederst: på vej ind mod kysten bliver bølgen langsommere, kortere og højere.</w:t>
+              <w:t xml:space="preserve">Figur 2: Øverst: et jordskælv løfter havbunden, og hele vandsøjlen over den løftes med. Nederst: på vej ind mod kysten bliver bølgen langsommere, kortere og højere.</w:t>
             </w:r>
           </w:p>
-          <w:bookmarkEnd w:id="24"/>
+          <w:bookmarkEnd w:id="27"/>
         </w:tc>
       </w:tr>
     </w:tbl>
@@ -391,18 +470,18 @@
                 <wp:inline>
                   <wp:extent cx="152400" cy="152400"/>
                   <wp:effectExtent b="0" l="0" r="0" t="0"/>
-                  <wp:docPr descr="" title="" id="26" name="Picture"/>
+                  <wp:docPr descr="" title="" id="29" name="Picture"/>
                   <a:graphic>
                     <a:graphicData uri="http://schemas.openxmlformats.org/drawingml/2006/picture">
                       <pic:pic>
                         <pic:nvPicPr>
-                          <pic:cNvPr descr="/tmp/claude-0/-home-user-smbi/7d291b92-c289-57a9-b4b8-12c4134f11be/scratchpad/qo/quarto-1.10.18/share/formats/docx/note.png" id="27" name="Picture"/>
+                          <pic:cNvPr descr="/workspace/tools/quarto-1.10.18/share/formats/docx/note.png" id="30" name="Picture"/>
                           <pic:cNvPicPr>
                             <a:picLocks noChangeArrowheads="1" noChangeAspect="1"/>
                           </pic:cNvPicPr>
                         </pic:nvPicPr>
                         <pic:blipFill>
-                          <a:blip r:embed="rId25"/>
+                          <a:blip r:embed="rId28"/>
                           <a:stretch>
                             <a:fillRect/>
                           </a:stretch>
@@ -515,173 +594,14 @@
         </w:tc>
       </w:tr>
     </w:tbl>
-    <w:bookmarkEnd w:id="28"/>
-    <w:bookmarkStart w:id="37" w:name="fremgangsmåde"/>
+    <w:bookmarkEnd w:id="31"/>
+    <w:bookmarkStart w:id="43" w:name="fremgangsmåde"/>
     <w:p>
       <w:pPr>
         <w:pStyle w:val="Heading2"/>
       </w:pPr>
       <w:r>
         <w:t xml:space="preserve">Fremgangsmåde</w:t>
-      </w:r>
-    </w:p>
-    <w:p>
-      <w:pPr>
-        <w:pStyle w:val="Compact"/>
-        <w:numPr>
-          <w:ilvl w:val="0"/>
-          <w:numId w:val="1002"/>
-        </w:numPr>
-      </w:pPr>
-      <w:r>
-        <w:t xml:space="preserve">Mål karrets indvendige længde</w:t>
-      </w:r>
-      <w:r>
-        <w:t xml:space="preserve"> </w:t>
-      </w:r>
-      <m:oMath>
-        <m:r>
-          <m:t>L</m:t>
-        </m:r>
-      </m:oMath>
-      <w:r>
-        <w:t xml:space="preserve">. Det er én banelængde. Skriv den over</w:t>
-      </w:r>
-      <w:r>
-        <w:t xml:space="preserve"> </w:t>
-      </w:r>
-      <w:hyperlink w:anchor="tbl-1">
-        <w:r>
-          <w:rPr>
-            <w:rStyle w:val="Hyperlink"/>
-          </w:rPr>
-          <w:t xml:space="preserve">Tabel 1</w:t>
-        </w:r>
-      </w:hyperlink>
-      <w:r>
-        <w:t xml:space="preserve">.</w:t>
-      </w:r>
-    </w:p>
-    <w:p>
-      <w:pPr>
-        <w:pStyle w:val="Compact"/>
-        <w:numPr>
-          <w:ilvl w:val="0"/>
-          <w:numId w:val="1002"/>
-        </w:numPr>
-      </w:pPr>
-      <w:r>
-        <w:t xml:space="preserve">Stil karret på et vandret bord, og fyld vand i, til dybden er ca. 0,025 m (2,5 cm). Mål dybden så nøjagtigt som muligt, gerne et par steder i karret, og skriv den i</w:t>
-      </w:r>
-      <w:r>
-        <w:t xml:space="preserve"> </w:t>
-      </w:r>
-      <w:hyperlink w:anchor="tbl-1">
-        <w:r>
-          <w:rPr>
-            <w:rStyle w:val="Hyperlink"/>
-          </w:rPr>
-          <w:t xml:space="preserve">Tabel 1</w:t>
-        </w:r>
-      </w:hyperlink>
-      <w:r>
-        <w:t xml:space="preserve">.</w:t>
-      </w:r>
-    </w:p>
-    <w:p>
-      <w:pPr>
-        <w:pStyle w:val="Compact"/>
-        <w:numPr>
-          <w:ilvl w:val="0"/>
-          <w:numId w:val="1002"/>
-        </w:numPr>
-      </w:pPr>
-      <w:r>
-        <w:t xml:space="preserve">Løft den ene ende (A) ca. 5 cm, fx op på en klods, og vent, til vandet står stille (</w:t>
-      </w:r>
-      <w:hyperlink w:anchor="fig-opstilling">
-        <w:r>
-          <w:rPr>
-            <w:rStyle w:val="Hyperlink"/>
-          </w:rPr>
-          <w:t xml:space="preserve">Figur 2</w:t>
-        </w:r>
-      </w:hyperlink>
-      <w:r>
-        <w:t xml:space="preserve">, øverst).</w:t>
-      </w:r>
-    </w:p>
-    <w:p>
-      <w:pPr>
-        <w:pStyle w:val="Compact"/>
-        <w:numPr>
-          <w:ilvl w:val="0"/>
-          <w:numId w:val="1002"/>
-        </w:numPr>
-      </w:pPr>
-      <w:r>
-        <w:t xml:space="preserve">Sæt karret ned igen i én rolig bevægelse, og start stopuret i samme øjeblik. Der starter nu en bølge i den ende, der blev stående (B). Den løber mod A, bliver kastet tilbage af den lodrette side og fortsætter frem og tilbage.</w:t>
-      </w:r>
-    </w:p>
-    <w:p>
-      <w:pPr>
-        <w:pStyle w:val="Compact"/>
-        <w:numPr>
-          <w:ilvl w:val="0"/>
-          <w:numId w:val="1002"/>
-        </w:numPr>
-      </w:pPr>
-      <w:r>
-        <w:t xml:space="preserve">Stop uret, når bølgen har løbet fem banelængder. Det er, når den rammer ende A for tredje gang (</w:t>
-      </w:r>
-      <w:hyperlink w:anchor="fig-opstilling">
-        <w:r>
-          <w:rPr>
-            <w:rStyle w:val="Hyperlink"/>
-          </w:rPr>
-          <w:t xml:space="preserve">Figur 2</w:t>
-        </w:r>
-      </w:hyperlink>
-      <w:r>
-        <w:t xml:space="preserve">, nederst). Skriv tiden i</w:t>
-      </w:r>
-      <w:r>
-        <w:t xml:space="preserve"> </w:t>
-      </w:r>
-      <w:hyperlink w:anchor="tbl-1">
-        <w:r>
-          <w:rPr>
-            <w:rStyle w:val="Hyperlink"/>
-          </w:rPr>
-          <w:t xml:space="preserve">Tabel 1</w:t>
-        </w:r>
-      </w:hyperlink>
-      <w:r>
-        <w:t xml:space="preserve">.</w:t>
-      </w:r>
-    </w:p>
-    <w:p>
-      <w:pPr>
-        <w:pStyle w:val="Compact"/>
-        <w:numPr>
-          <w:ilvl w:val="0"/>
-          <w:numId w:val="1002"/>
-        </w:numPr>
-      </w:pPr>
-      <w:r>
-        <w:t xml:space="preserve">Gentag trin 3–5, så I har fire målinger ved samme dybde.</w:t>
-      </w:r>
-    </w:p>
-    <w:p>
-      <w:pPr>
-        <w:pStyle w:val="Compact"/>
-        <w:numPr>
-          <w:ilvl w:val="0"/>
-          <w:numId w:val="1002"/>
-        </w:numPr>
-      </w:pPr>
-      <w:r>
-        <w:t xml:space="preserve">Gentag det hele med en vanddybde på ca. 0,05 m og ca. 0,10 m.</w:t>
       </w:r>
     </w:p>
     <w:tbl>
@@ -697,7 +617,245 @@
       <w:tr>
         <w:tc>
           <w:tcPr/>
-          <w:bookmarkStart w:id="33" w:name="fig-opstilling"/>
+          <w:bookmarkStart w:id="35" w:name="fig-vandkar-foto"/>
+          <w:p>
+            <w:pPr>
+              <w:pStyle w:val="Compact"/>
+              <w:jc w:val="center"/>
+            </w:pPr>
+            <w:r>
+              <w:drawing>
+                <wp:inline>
+                  <wp:extent cx="5486400" cy="3657600"/>
+                  <wp:effectExtent b="0" l="0" r="0" t="0"/>
+                  <wp:docPr descr="" title="" id="33" name="Picture"/>
+                  <a:graphic>
+                    <a:graphicData uri="http://schemas.openxmlformats.org/drawingml/2006/picture">
+                      <pic:pic>
+                        <pic:nvPicPr>
+                          <pic:cNvPr descr="figurer/vandkar-forsog.jpg" id="34" name="Picture"/>
+                          <pic:cNvPicPr>
+                            <a:picLocks noChangeArrowheads="1" noChangeAspect="1"/>
+                          </pic:cNvPicPr>
+                        </pic:nvPicPr>
+                        <pic:blipFill>
+                          <a:blip r:embed="rId32"/>
+                          <a:stretch>
+                            <a:fillRect/>
+                          </a:stretch>
+                        </pic:blipFill>
+                        <pic:spPr bwMode="auto">
+                          <a:xfrm>
+                            <a:off x="0" y="0"/>
+                            <a:ext cx="5486400" cy="3657600"/>
+                          </a:xfrm>
+                          <a:prstGeom prst="rect">
+                            <a:avLst/>
+                          </a:prstGeom>
+                          <a:noFill/>
+                          <a:ln w="9525">
+                            <a:noFill/>
+                            <a:headEnd/>
+                            <a:tailEnd/>
+                          </a:ln>
+                        </pic:spPr>
+                      </pic:pic>
+                    </a:graphicData>
+                  </a:graphic>
+                </wp:inline>
+              </w:drawing>
+            </w:r>
+          </w:p>
+          <w:p>
+            <w:pPr>
+              <w:jc w:val="center"/>
+            </w:pPr>
+            <w:pPr>
+              <w:jc w:val="left"/>
+              <w:spacing w:before="200"/>
+              <w:pStyle w:val="ImageCaption"/>
+            </w:pPr>
+            <w:r>
+              <w:t xml:space="preserve">Figur 3: Eksempel på forsøgsopstillingen: et aflangt, gennemsigtigt vandkar, en tommestok, en klods og en mobiltelefon til tidtagning. Her står karret vandret, som under målingen. AI-genereret illustration; mål altid længde og vanddybde i jeres eget kar.</w:t>
+            </w:r>
+          </w:p>
+          <w:bookmarkEnd w:id="35"/>
+        </w:tc>
+      </w:tr>
+    </w:tbl>
+    <w:p>
+      <w:pPr>
+        <w:pStyle w:val="Compact"/>
+        <w:numPr>
+          <w:ilvl w:val="0"/>
+          <w:numId w:val="1002"/>
+        </w:numPr>
+      </w:pPr>
+      <w:r>
+        <w:t xml:space="preserve">Mål karrets indvendige længde</w:t>
+      </w:r>
+      <w:r>
+        <w:t xml:space="preserve"> </w:t>
+      </w:r>
+      <m:oMath>
+        <m:r>
+          <m:t>L</m:t>
+        </m:r>
+      </m:oMath>
+      <w:r>
+        <w:t xml:space="preserve">. Det er én banelængde. Skriv den over</w:t>
+      </w:r>
+      <w:r>
+        <w:t xml:space="preserve"> </w:t>
+      </w:r>
+      <w:hyperlink w:anchor="tbl-1">
+        <w:r>
+          <w:rPr>
+            <w:rStyle w:val="Hyperlink"/>
+          </w:rPr>
+          <w:t xml:space="preserve">Tabel 1</w:t>
+        </w:r>
+      </w:hyperlink>
+      <w:r>
+        <w:t xml:space="preserve">.</w:t>
+      </w:r>
+    </w:p>
+    <w:p>
+      <w:pPr>
+        <w:pStyle w:val="Compact"/>
+        <w:numPr>
+          <w:ilvl w:val="0"/>
+          <w:numId w:val="1002"/>
+        </w:numPr>
+      </w:pPr>
+      <w:r>
+        <w:t xml:space="preserve">Stil karret på et vandret bord, og fyld vand i, til dybden er ca. 0,025 m (2,5 cm). Mål dybden så nøjagtigt som muligt, gerne et par steder i karret, og skriv den i</w:t>
+      </w:r>
+      <w:r>
+        <w:t xml:space="preserve"> </w:t>
+      </w:r>
+      <w:hyperlink w:anchor="tbl-1">
+        <w:r>
+          <w:rPr>
+            <w:rStyle w:val="Hyperlink"/>
+          </w:rPr>
+          <w:t xml:space="preserve">Tabel 1</w:t>
+        </w:r>
+      </w:hyperlink>
+      <w:r>
+        <w:t xml:space="preserve">.</w:t>
+      </w:r>
+    </w:p>
+    <w:p>
+      <w:pPr>
+        <w:pStyle w:val="Compact"/>
+        <w:numPr>
+          <w:ilvl w:val="0"/>
+          <w:numId w:val="1002"/>
+        </w:numPr>
+      </w:pPr>
+      <w:r>
+        <w:t xml:space="preserve">Løft den ene ende (A) ca. 5 cm, fx op på en klods, og vent, til vandet står stille (</w:t>
+      </w:r>
+      <w:hyperlink w:anchor="fig-opstilling">
+        <w:r>
+          <w:rPr>
+            <w:rStyle w:val="Hyperlink"/>
+          </w:rPr>
+          <w:t xml:space="preserve">Figur 4</w:t>
+        </w:r>
+      </w:hyperlink>
+      <w:r>
+        <w:t xml:space="preserve">, øverst).</w:t>
+      </w:r>
+    </w:p>
+    <w:p>
+      <w:pPr>
+        <w:pStyle w:val="Compact"/>
+        <w:numPr>
+          <w:ilvl w:val="0"/>
+          <w:numId w:val="1002"/>
+        </w:numPr>
+      </w:pPr>
+      <w:r>
+        <w:t xml:space="preserve">Sæt karret ned igen i én rolig bevægelse, og start stopuret i samme øjeblik. Der starter nu en bølge i den ende, der blev stående (B). Den løber mod A, bliver kastet tilbage af den lodrette side og fortsætter frem og tilbage.</w:t>
+      </w:r>
+    </w:p>
+    <w:p>
+      <w:pPr>
+        <w:pStyle w:val="Compact"/>
+        <w:numPr>
+          <w:ilvl w:val="0"/>
+          <w:numId w:val="1002"/>
+        </w:numPr>
+      </w:pPr>
+      <w:r>
+        <w:t xml:space="preserve">Stop uret, når bølgen har løbet fem banelængder. Det er, når den rammer ende A for tredje gang (</w:t>
+      </w:r>
+      <w:hyperlink w:anchor="fig-opstilling">
+        <w:r>
+          <w:rPr>
+            <w:rStyle w:val="Hyperlink"/>
+          </w:rPr>
+          <w:t xml:space="preserve">Figur 4</w:t>
+        </w:r>
+      </w:hyperlink>
+      <w:r>
+        <w:t xml:space="preserve">, nederst). Skriv tiden i</w:t>
+      </w:r>
+      <w:r>
+        <w:t xml:space="preserve"> </w:t>
+      </w:r>
+      <w:hyperlink w:anchor="tbl-1">
+        <w:r>
+          <w:rPr>
+            <w:rStyle w:val="Hyperlink"/>
+          </w:rPr>
+          <w:t xml:space="preserve">Tabel 1</w:t>
+        </w:r>
+      </w:hyperlink>
+      <w:r>
+        <w:t xml:space="preserve">.</w:t>
+      </w:r>
+    </w:p>
+    <w:p>
+      <w:pPr>
+        <w:pStyle w:val="Compact"/>
+        <w:numPr>
+          <w:ilvl w:val="0"/>
+          <w:numId w:val="1002"/>
+        </w:numPr>
+      </w:pPr>
+      <w:r>
+        <w:t xml:space="preserve">Gentag trin 3–5, så I har fire målinger ved samme dybde.</w:t>
+      </w:r>
+    </w:p>
+    <w:p>
+      <w:pPr>
+        <w:pStyle w:val="Compact"/>
+        <w:numPr>
+          <w:ilvl w:val="0"/>
+          <w:numId w:val="1002"/>
+        </w:numPr>
+      </w:pPr>
+      <w:r>
+        <w:t xml:space="preserve">Gentag det hele med en vanddybde på ca. 0,05 m og ca. 0,10 m.</w:t>
+      </w:r>
+    </w:p>
+    <w:tbl>
+      <w:tblPr>
+        <w:tblStyle w:val="Table"/>
+        <w:tblW w:type="pct" w:w="5000"/>
+        <w:tblLayout w:type="fixed"/>
+        <w:tblLook w:firstRow="0" w:lastRow="0" w:firstColumn="0" w:lastColumn="0" w:noHBand="0" w:noVBand="0" w:val="0000"/>
+      </w:tblPr>
+      <w:tblGrid>
+        <w:gridCol w:w="7920"/>
+      </w:tblGrid>
+      <w:tr>
+        <w:tc>
+          <w:tcPr/>
+          <w:bookmarkStart w:id="39" w:name="fig-opstilling"/>
           <w:p>
             <w:pPr>
               <w:pStyle w:val="Compact"/>
@@ -708,24 +866,24 @@
                 <wp:inline>
                   <wp:extent cx="6096000" cy="4095750"/>
                   <wp:effectExtent b="0" l="0" r="0" t="0"/>
-                  <wp:docPr descr="" title="" id="30" name="Picture"/>
+                  <wp:docPr descr="" title="" id="37" name="Picture"/>
                   <a:graphic>
                     <a:graphicData uri="http://schemas.openxmlformats.org/drawingml/2006/picture">
                       <pic:pic>
                         <pic:nvPicPr>
-                          <pic:cNvPr descr="figurer/opstilling.svg" id="31" name="Picture"/>
+                          <pic:cNvPr descr="figurer/opstilling.svg" id="38" name="Picture"/>
                           <pic:cNvPicPr>
                             <a:picLocks noChangeArrowheads="1" noChangeAspect="1"/>
                           </pic:cNvPicPr>
                         </pic:nvPicPr>
                         <pic:blipFill>
-                          <a:blip r:embed="rId32">
+                          <a:blip>
                             <a:extLst>
                               <a:ext uri="{28A0092B-C50C-407E-A947-70E740481C1C}">
                                 <ns6:useLocalDpi val="0"/>
                               </a:ext>
                               <a:ext uri="{96DAC541-7B7A-43D3-8B79-37D633B846F1}">
-                                <ns7:svgBlip r:embed="rId29"/>
+                                <ns7:svgBlip r:embed="rId36"/>
                               </a:ext>
                             </a:extLst>
                           </a:blip>
@@ -765,10 +923,10 @@
               <w:pStyle w:val="ImageCaption"/>
             </w:pPr>
             <w:r>
-              <w:t xml:space="preserve">Figur 2: Opstillingen. Ende A løftes, og vandet bliver dybest i ende B (1). Når karret sættes ned, løber bølgen frem og tilbage, og I tager tid på fem banelængder (2).</w:t>
+              <w:t xml:space="preserve">Figur 4: Opstillingen. Ende A løftes, og vandet bliver dybest i ende B (1). Når karret sættes ned, løber bølgen frem og tilbage, og I tager tid på fem banelængder (2).</w:t>
             </w:r>
           </w:p>
-          <w:bookmarkEnd w:id="33"/>
+          <w:bookmarkEnd w:id="39"/>
         </w:tc>
       </w:tr>
     </w:tbl>
@@ -822,18 +980,18 @@
                 <wp:inline>
                   <wp:extent cx="152400" cy="152400"/>
                   <wp:effectExtent b="0" l="0" r="0" t="0"/>
-                  <wp:docPr descr="" title="" id="35" name="Picture"/>
+                  <wp:docPr descr="" title="" id="41" name="Picture"/>
                   <a:graphic>
                     <a:graphicData uri="http://schemas.openxmlformats.org/drawingml/2006/picture">
                       <pic:pic>
                         <pic:nvPicPr>
-                          <pic:cNvPr descr="/tmp/claude-0/-home-user-smbi/7d291b92-c289-57a9-b4b8-12c4134f11be/scratchpad/qo/quarto-1.10.18/share/formats/docx/tip.png" id="36" name="Picture"/>
+                          <pic:cNvPr descr="/workspace/tools/quarto-1.10.18/share/formats/docx/tip.png" id="42" name="Picture"/>
                           <pic:cNvPicPr>
                             <a:picLocks noChangeArrowheads="1" noChangeAspect="1"/>
                           </pic:cNvPicPr>
                         </pic:nvPicPr>
                         <pic:blipFill>
-                          <a:blip r:embed="rId34"/>
+                          <a:blip r:embed="rId40"/>
                           <a:stretch>
                             <a:fillRect/>
                           </a:stretch>
@@ -910,8 +1068,8 @@
         </w:tc>
       </w:tr>
     </w:tbl>
-    <w:bookmarkEnd w:id="37"/>
-    <w:bookmarkStart w:id="39" w:name="registrering-af-målinger"/>
+    <w:bookmarkEnd w:id="43"/>
+    <w:bookmarkStart w:id="45" w:name="registrering-af-målinger"/>
     <w:p>
       <w:pPr>
         <w:pStyle w:val="Heading2"/>
@@ -993,7 +1151,7 @@
       <w:tr>
         <w:tc>
           <w:tcPr/>
-          <w:bookmarkStart w:id="38" w:name="tbl-1"/>
+          <w:bookmarkStart w:id="44" w:name="tbl-1"/>
           <w:p>
             <w:pPr>
               <w:jc w:val="center"/>
@@ -1313,13 +1471,13 @@
               </w:tc>
             </w:tr>
           </w:tbl>
-          <w:bookmarkEnd w:id="38"/>
+          <w:bookmarkEnd w:id="44"/>
           <w:p/>
         </w:tc>
       </w:tr>
     </w:tbl>
-    <w:bookmarkEnd w:id="39"/>
-    <w:bookmarkStart w:id="42" w:name="databehandling"/>
+    <w:bookmarkEnd w:id="45"/>
+    <w:bookmarkStart w:id="48" w:name="databehandling"/>
     <w:p>
       <w:pPr>
         <w:pStyle w:val="Heading2"/>
@@ -1661,7 +1819,7 @@
       <w:tr>
         <w:tc>
           <w:tcPr/>
-          <w:bookmarkStart w:id="40" w:name="tbl-2"/>
+          <w:bookmarkStart w:id="46" w:name="tbl-2"/>
           <w:p>
             <w:pPr>
               <w:jc w:val="center"/>
@@ -1988,7 +2146,7 @@
               </w:tc>
             </w:tr>
           </w:tbl>
-          <w:bookmarkEnd w:id="40"/>
+          <w:bookmarkEnd w:id="46"/>
           <w:p/>
         </w:tc>
       </w:tr>
@@ -2143,7 +2301,7 @@
       <w:tr>
         <w:tc>
           <w:tcPr/>
-          <w:bookmarkStart w:id="41" w:name="tbl-3"/>
+          <w:bookmarkStart w:id="47" w:name="tbl-3"/>
           <w:p>
             <w:pPr>
               <w:jc w:val="center"/>
@@ -2497,13 +2655,13 @@
               </w:tc>
             </w:tr>
           </w:tbl>
-          <w:bookmarkEnd w:id="41"/>
+          <w:bookmarkEnd w:id="47"/>
           <w:p/>
         </w:tc>
       </w:tr>
     </w:tbl>
-    <w:bookmarkEnd w:id="42"/>
-    <w:bookmarkStart w:id="43" w:name="journalspørgsmål"/>
+    <w:bookmarkEnd w:id="48"/>
+    <w:bookmarkStart w:id="49" w:name="journalspørgsmål"/>
     <w:p>
       <w:pPr>
         <w:pStyle w:val="Heading2"/>
@@ -2610,7 +2768,7 @@
         <w:t xml:space="preserve">Bølgen i karret er få centimeter høj og under en meter lang, mens en tsunami er hundreder af kilometer lang. Diskutér, hvor godt vandkarret er som model af en tsunami. Hvad har de to bølger til fælles, og hvad er forskelligt?</w:t>
       </w:r>
     </w:p>
-    <w:bookmarkEnd w:id="43"/>
+    <w:bookmarkEnd w:id="49"/>
     <w:sectPr>
       <w:headerReference r:id="rId7" w:type="default"/>
       <w:footerReference r:id="rId8" w:type="default"/>

</xml_diff>